<commit_message>
chore: checkpoint recent workspace updates
</commit_message>
<xml_diff>
--- a/prdforge-pack/docx/PRDForge - Delivery Roadmap and Tracker.docx
+++ b/prdforge-pack/docx/PRDForge - Delivery Roadmap and Tracker.docx
@@ -46,7 +46,7 @@
         <w:pStyle w:val="Heading1"/>
       </w:pPr>
       <w:r>
-        <w:t>Delivery Roadmap + Execution Tracker</w:t>
+        <w:t>PRDForge — Launch Operations and KPI Tracker</w:t>
       </w:r>
     </w:p>
     <w:p/>
@@ -55,7 +55,7 @@
         <w:pStyle w:val="Heading2"/>
       </w:pPr>
       <w:r>
-        <w:t>1) Milestone Plan</w:t>
+        <w:t>Milestone Plan</w:t>
       </w:r>
     </w:p>
     <w:p>
@@ -63,7 +63,7 @@
         <w:pStyle w:val="Heading3"/>
       </w:pPr>
       <w:r>
-        <w:t>M1: Discovery + Validation</w:t>
+        <w:t>M1: Stabilization Complete</w:t>
       </w:r>
     </w:p>
     <w:p>
@@ -79,15 +79,7 @@
         <w:pStyle w:val="ListBullet"/>
       </w:pPr>
       <w:r>
-        <w:t>Deliverables:</w:t>
-      </w:r>
-    </w:p>
-    <w:p>
-      <w:pPr>
-        <w:pStyle w:val="ListBullet"/>
-      </w:pPr>
-      <w:r>
-        <w:t>Exit criteria:</w:t>
+        <w:t>Exit criteria: P0 = 0, core flow stable</w:t>
       </w:r>
     </w:p>
     <w:p/>
@@ -96,7 +88,7 @@
         <w:pStyle w:val="Heading3"/>
       </w:pPr>
       <w:r>
-        <w:t>M2: MVP Build</w:t>
+        <w:t>M2: QA/UAT Complete</w:t>
       </w:r>
     </w:p>
     <w:p>
@@ -112,15 +104,7 @@
         <w:pStyle w:val="ListBullet"/>
       </w:pPr>
       <w:r>
-        <w:t>Deliverables:</w:t>
-      </w:r>
-    </w:p>
-    <w:p>
-      <w:pPr>
-        <w:pStyle w:val="ListBullet"/>
-      </w:pPr>
-      <w:r>
-        <w:t>Exit criteria:</w:t>
+        <w:t>Exit criteria: UAT signed, Go/No-Go draft ready</w:t>
       </w:r>
     </w:p>
     <w:p/>
@@ -129,7 +113,7 @@
         <w:pStyle w:val="Heading3"/>
       </w:pPr>
       <w:r>
-        <w:t>M3: Pilot Launch</w:t>
+        <w:t>M3: Commercial Readiness Complete</w:t>
       </w:r>
     </w:p>
     <w:p>
@@ -145,15 +129,7 @@
         <w:pStyle w:val="ListBullet"/>
       </w:pPr>
       <w:r>
-        <w:t>Deliverables:</w:t>
-      </w:r>
-    </w:p>
-    <w:p>
-      <w:pPr>
-        <w:pStyle w:val="ListBullet"/>
-      </w:pPr>
-      <w:r>
-        <w:t>Exit criteria:</w:t>
+        <w:t>Exit criteria: billing and webhooks verified</w:t>
       </w:r>
     </w:p>
     <w:p/>
@@ -162,7 +138,7 @@
         <w:pStyle w:val="Heading3"/>
       </w:pPr>
       <w:r>
-        <w:t>M4: Production Launch</w:t>
+        <w:t>M4: Launch + Monitoring Window</w:t>
       </w:r>
     </w:p>
     <w:p>
@@ -178,15 +154,7 @@
         <w:pStyle w:val="ListBullet"/>
       </w:pPr>
       <w:r>
-        <w:t>Deliverables:</w:t>
-      </w:r>
-    </w:p>
-    <w:p>
-      <w:pPr>
-        <w:pStyle w:val="ListBullet"/>
-      </w:pPr>
-      <w:r>
-        <w:t>Exit criteria:</w:t>
+        <w:t>Exit criteria: stable first 72 hours, no critical incidents</w:t>
       </w:r>
     </w:p>
     <w:p/>
@@ -195,7 +163,7 @@
         <w:pStyle w:val="Heading2"/>
       </w:pPr>
       <w:r>
-        <w:t>2) Sprint Tracker (Current)</w:t>
+        <w:t>Execution Tracker</w:t>
       </w:r>
     </w:p>
     <w:p>
@@ -219,7 +187,7 @@
         <w:rPr>
           <w:sz w:val="22"/>
         </w:rPr>
-        <w:t>| PF-001 |  |  | High | Todo |  |</w:t>
+        <w:t>| LF-001 | Resolve all P0/P1 defects |  | High | Todo |  |</w:t>
       </w:r>
     </w:p>
     <w:p>
@@ -227,7 +195,7 @@
         <w:rPr>
           <w:sz w:val="22"/>
         </w:rPr>
-        <w:t>| PF-002 |  |  | High | Todo |  |</w:t>
+        <w:t>| LF-002 | Complete full QA matrix run |  | High | Todo |  |</w:t>
       </w:r>
     </w:p>
     <w:p>
@@ -235,7 +203,23 @@
         <w:rPr>
           <w:sz w:val="22"/>
         </w:rPr>
-        <w:t>| PF-003 |  |  | Medium | Todo |  |</w:t>
+        <w:t>| LF-003 | Validate billing lifecycle E2E |  | High | Todo |  |</w:t>
+      </w:r>
+    </w:p>
+    <w:p>
+      <w:r>
+        <w:rPr>
+          <w:sz w:val="22"/>
+        </w:rPr>
+        <w:t>| LF-004 | Finalize launch assets and copy |  | Medium | Todo |  |</w:t>
+      </w:r>
+    </w:p>
+    <w:p>
+      <w:r>
+        <w:rPr>
+          <w:sz w:val="22"/>
+        </w:rPr>
+        <w:t>| LF-005 | Confirm dashboards and alerting |  | High | Todo |  |</w:t>
       </w:r>
     </w:p>
     <w:p/>
@@ -244,31 +228,55 @@
         <w:pStyle w:val="Heading2"/>
       </w:pPr>
       <w:r>
-        <w:t>3) Decision Log</w:t>
+        <w:t>KPI Dashboard (Launch Week)</w:t>
       </w:r>
     </w:p>
     <w:p>
+      <w:pPr>
+        <w:pStyle w:val="ListBullet"/>
+      </w:pPr>
       <w:r>
-        <w:rPr>
-          <w:sz w:val="22"/>
-        </w:rPr>
-        <w:t>| Date | Decision | Rationale | Impact |</w:t>
+        <w:t>Activation rate:</w:t>
       </w:r>
     </w:p>
     <w:p>
+      <w:pPr>
+        <w:pStyle w:val="ListBullet"/>
+      </w:pPr>
       <w:r>
-        <w:rPr>
-          <w:sz w:val="22"/>
-        </w:rPr>
-        <w:t>|---|---|---|---|</w:t>
+        <w:t>Day-1 retention:</w:t>
       </w:r>
     </w:p>
     <w:p>
+      <w:pPr>
+        <w:pStyle w:val="ListBullet"/>
+      </w:pPr>
       <w:r>
-        <w:rPr>
-          <w:sz w:val="22"/>
-        </w:rPr>
-        <w:t>|  |  |  |  |</w:t>
+        <w:t>PRD completion rate:</w:t>
+      </w:r>
+    </w:p>
+    <w:p>
+      <w:pPr>
+        <w:pStyle w:val="ListBullet"/>
+      </w:pPr>
+      <w:r>
+        <w:t>Export conversion rate:</w:t>
+      </w:r>
+    </w:p>
+    <w:p>
+      <w:pPr>
+        <w:pStyle w:val="ListBullet"/>
+      </w:pPr>
+      <w:r>
+        <w:t>Trial-to-paid conversion:</w:t>
+      </w:r>
+    </w:p>
+    <w:p>
+      <w:pPr>
+        <w:pStyle w:val="ListBullet"/>
+      </w:pPr>
+      <w:r>
+        <w:t>Support ticket volume:</w:t>
       </w:r>
     </w:p>
     <w:p/>
@@ -277,7 +285,7 @@
         <w:pStyle w:val="Heading2"/>
       </w:pPr>
       <w:r>
-        <w:t>4) Blockers</w:t>
+        <w:t>Daily Launch Standup Log</w:t>
       </w:r>
     </w:p>
     <w:p>
@@ -285,7 +293,7 @@
         <w:rPr>
           <w:sz w:val="22"/>
         </w:rPr>
-        <w:t>| Blocker | Owner | Unblock Action | ETA |</w:t>
+        <w:t>| Date | Status | Key Risks | Decisions | Owner |</w:t>
       </w:r>
     </w:p>
     <w:p>
@@ -293,7 +301,7 @@
         <w:rPr>
           <w:sz w:val="22"/>
         </w:rPr>
-        <w:t>|---|---|---|---|</w:t>
+        <w:t>|---|---|---|---|---|</w:t>
       </w:r>
     </w:p>
     <w:p>
@@ -301,7 +309,7 @@
         <w:rPr>
           <w:sz w:val="22"/>
         </w:rPr>
-        <w:t>|  |  |  |  |</w:t>
+        <w:t>|  |  |  |  |  |</w:t>
       </w:r>
     </w:p>
     <w:sectPr>

</xml_diff>